<commit_message>
docs: add Dev 2 testing entries to master document
</commit_message>
<xml_diff>
--- a/docs/Team-46-Client-and-CRM-Team-B-Master-Document.docx
+++ b/docs/Team-46-Client-and-CRM-Team-B-Master-Document.docx
@@ -1,6 +1,6 @@
 
 <file path=word/document.xml><?xml version="1.0" encoding="utf-8"?>
-<w:document xmlns:wpc="http://schemas.microsoft.com/office/word/2010/wordprocessingCanvas" xmlns:cx="http://schemas.microsoft.com/office/drawing/2014/chartex" xmlns:cx1="http://schemas.microsoft.com/office/drawing/2015/9/8/chartex" xmlns:cx2="http://schemas.microsoft.com/office/drawing/2015/10/21/chartex" xmlns:cx3="http://schemas.microsoft.com/office/drawing/2016/5/9/chartex" xmlns:cx4="http://schemas.microsoft.com/office/drawing/2016/5/10/chartex" xmlns:cx5="http://schemas.microsoft.com/office/drawing/2016/5/11/chartex" xmlns:cx6="http://schemas.microsoft.com/office/drawing/2016/5/12/chartex" xmlns:cx7="http://schemas.microsoft.com/office/drawing/2016/5/13/chartex" xmlns:cx8="http://schemas.microsoft.com/office/drawing/2016/5/14/chartex" xmlns:mc="http://schemas.openxmlformats.org/markup-compatibility/2006" xmlns:aink="http://schemas.microsoft.com/office/drawing/2016/ink" xmlns:am3d="http://schemas.microsoft.com/office/drawing/2017/model3d" xmlns:o="urn:schemas-microsoft-com:office:office" xmlns:oel="http://schemas.microsoft.com/office/2019/extlst" xmlns:r="http://schemas.openxmlformats.org/officeDocument/2006/relationships" xmlns:m="http://schemas.openxmlformats.org/officeDocument/2006/math" xmlns:v="urn:schemas-microsoft-com:vml" xmlns:wp14="http://schemas.microsoft.com/office/word/2010/wordprocessingDrawing" xmlns:wp="http://schemas.openxmlformats.org/drawingml/2006/wordprocessingDrawing" xmlns:w10="urn:schemas-microsoft-com:office:word" xmlns:w="http://schemas.openxmlformats.org/wordprocessingml/2006/main" xmlns:w14="http://schemas.microsoft.com/office/word/2010/wordml" xmlns:w15="http://schemas.microsoft.com/office/word/2012/wordml" xmlns:w16cex="http://schemas.microsoft.com/office/word/2018/wordml/cex" xmlns:w16cid="http://schemas.microsoft.com/office/word/2016/wordml/cid" xmlns:w16="http://schemas.microsoft.com/office/word/2018/wordml" xmlns:w16du="http://schemas.microsoft.com/office/word/2023/wordml/word16du" xmlns:w16sdtdh="http://schemas.microsoft.com/office/word/2020/wordml/sdtdatahash" xmlns:w16sdtfl="http://schemas.microsoft.com/office/word/2024/wordml/sdtformatlock" xmlns:w16se="http://schemas.microsoft.com/office/word/2015/wordml/symex" xmlns:wpg="http://schemas.microsoft.com/office/word/2010/wordprocessingGroup" xmlns:wpi="http://schemas.microsoft.com/office/word/2010/wordprocessingInk" xmlns:wne="http://schemas.microsoft.com/office/word/2006/wordml" xmlns:wps="http://schemas.microsoft.com/office/word/2010/wordprocessingShape" mc:Ignorable="w14 w15 w16se w16cid w16 w16cex w16sdtdh w16sdtfl w16du wp14">
+<w:document xmlns:wpc="http://schemas.microsoft.com/office/word/2010/wordprocessingCanvas" xmlns:cx="http://schemas.microsoft.com/office/drawing/2014/chartex" xmlns:cx1="http://schemas.microsoft.com/office/drawing/2015/9/8/chartex" xmlns:cx2="http://schemas.microsoft.com/office/drawing/2015/10/21/chartex" xmlns:cx3="http://schemas.microsoft.com/office/drawing/2016/5/9/chartex" xmlns:cx4="http://schemas.microsoft.com/office/drawing/2016/5/10/chartex" xmlns:cx5="http://schemas.microsoft.com/office/drawing/2016/5/11/chartex" xmlns:cx6="http://schemas.microsoft.com/office/drawing/2016/5/12/chartex" xmlns:cx7="http://schemas.microsoft.com/office/drawing/2016/5/13/chartex" xmlns:cx8="http://schemas.microsoft.com/office/drawing/2016/5/14/chartex" xmlns:mc="http://schemas.openxmlformats.org/markup-compatibility/2006" xmlns:m="http://schemas.openxmlformats.org/officeDocument/2006/math" xmlns:aink="http://schemas.microsoft.com/office/drawing/2016/ink" xmlns:am3d="http://schemas.microsoft.com/office/drawing/2017/model3d" xmlns:oel="http://schemas.microsoft.com/office/2019/extlst" xmlns:r="http://schemas.openxmlformats.org/officeDocument/2006/relationships" xmlns:wp14="http://schemas.microsoft.com/office/word/2010/wordprocessingDrawing" xmlns:wp="http://schemas.openxmlformats.org/drawingml/2006/wordprocessingDrawing" xmlns:wpg="http://schemas.microsoft.com/office/word/2010/wordprocessingGroup" xmlns:wpi="http://schemas.microsoft.com/office/word/2010/wordprocessingInk" xmlns:wps="http://schemas.microsoft.com/office/word/2010/wordprocessingShape" xmlns:o="urn:schemas-microsoft-com:office:office" xmlns:v="urn:schemas-microsoft-com:vml" xmlns:w10="urn:schemas-microsoft-com:office:word" xmlns:w="http://schemas.openxmlformats.org/wordprocessingml/2006/main" xmlns:w14="http://schemas.microsoft.com/office/word/2010/wordml" xmlns:w15="http://schemas.microsoft.com/office/word/2012/wordml" xmlns:w16cex="http://schemas.microsoft.com/office/word/2018/wordml/cex" xmlns:w16cid="http://schemas.microsoft.com/office/word/2016/wordml/cid" xmlns:w16="http://schemas.microsoft.com/office/word/2018/wordml" xmlns:w16sdtdh="http://schemas.microsoft.com/office/word/2020/wordml/sdtdatahash" xmlns:w16sdtfl="http://schemas.microsoft.com/office/word/2024/wordml/sdtformatlock" xmlns:w16se="http://schemas.microsoft.com/office/word/2015/wordml/symex" xmlns:w16du="http://schemas.microsoft.com/office/word/2023/wordml/word16du" xmlns:wne="http://schemas.microsoft.com/office/word/2006/wordml" mc:Ignorable="w14 w15 w16se w16cid w16 w16cex w16sdtdh w16sdtfl w16du wp14">
   <w:body>
     <w:p>
       <w:pPr>
@@ -43,7 +43,25 @@
           <w:bCs/>
           <w:color w:val="FF0000"/>
         </w:rPr>
-        <w:t>The git urls are fake – this is just an example</w:t>
+        <w:t xml:space="preserve">The git </w:t>
+      </w:r>
+      <w:proofErr w:type="spellStart"/>
+      <w:r>
+        <w:rPr>
+          <w:b/>
+          <w:bCs/>
+          <w:color w:val="FF0000"/>
+        </w:rPr>
+        <w:t>urls</w:t>
+      </w:r>
+      <w:proofErr w:type="spellEnd"/>
+      <w:r>
+        <w:rPr>
+          <w:b/>
+          <w:bCs/>
+          <w:color w:val="FF0000"/>
+        </w:rPr>
+        <w:t xml:space="preserve"> are fake – this is just an example</w:t>
       </w:r>
       <w:r>
         <w:br/>
@@ -268,7 +286,17 @@
           <w:color w:val="FFFFFF"/>
           <w:lang w:val="pl-PL"/>
         </w:rPr>
-        <w:t xml:space="preserve">Git URL:  </w:t>
+        <w:t xml:space="preserve">Git </w:t>
+      </w:r>
+      <w:proofErr w:type="gramStart"/>
+      <w:r>
+        <w:rPr>
+          <w:b/>
+          <w:bCs/>
+          <w:color w:val="FFFFFF"/>
+          <w:lang w:val="pl-PL"/>
+        </w:rPr>
+        <w:t xml:space="preserve">URL:  </w:t>
       </w:r>
       <w:r>
         <w:rPr>
@@ -278,6 +306,7 @@
         </w:rPr>
         <w:t>https://github.com/team-byte-size/team-page/blob/main/docs/requirements.md</w:t>
       </w:r>
+      <w:proofErr w:type="gramEnd"/>
     </w:p>
     <w:p>
       <w:pPr>
@@ -435,7 +464,15 @@
         <w:t xml:space="preserve">Done: </w:t>
       </w:r>
       <w:r>
-        <w:t>Produced mockups for the restyled login page and the team page layout, including the placeholder-avatar and long-blurb cases BA flagged.</w:t>
+        <w:t xml:space="preserve">Produced </w:t>
+      </w:r>
+      <w:proofErr w:type="spellStart"/>
+      <w:r>
+        <w:t>mockups</w:t>
+      </w:r>
+      <w:proofErr w:type="spellEnd"/>
+      <w:r>
+        <w:t xml:space="preserve"> for the restyled login page and the team page layout, including the placeholder-avatar and long-blurb cases BA flagged.</w:t>
       </w:r>
     </w:p>
     <w:p>
@@ -481,6 +518,7 @@
         <w:rPr>
           <w:noProof/>
         </w:rPr>
+        <w:lastRenderedPageBreak/>
         <w:drawing>
           <wp:inline distT="0" distB="0" distL="0" distR="0" wp14:anchorId="684C28BF" wp14:editId="6A30DE2E">
             <wp:extent cx="3503930" cy="2589530"/>
@@ -690,7 +728,15 @@
         <w:t xml:space="preserve">Done: </w:t>
       </w:r>
       <w:r>
-        <w:t>Checked both mockups against the requirements doc. All fields present, login scope stayed to styling only, placeholder-avatar and long-blurb cases both covered. Approved as-is, no changes requested.</w:t>
+        <w:t xml:space="preserve">Checked both </w:t>
+      </w:r>
+      <w:proofErr w:type="spellStart"/>
+      <w:r>
+        <w:t>mockups</w:t>
+      </w:r>
+      <w:proofErr w:type="spellEnd"/>
+      <w:r>
+        <w:t xml:space="preserve"> against the requirements doc. All fields present, login scope stayed to styling only, placeholder-avatar and long-blurb cases both covered. Approved as-is, no changes requested.</w:t>
       </w:r>
     </w:p>
     <w:p>
@@ -739,7 +785,17 @@
           <w:color w:val="FFFFFF"/>
           <w:lang w:val="pl-PL"/>
         </w:rPr>
-        <w:t xml:space="preserve">Git URL:  </w:t>
+        <w:t xml:space="preserve">Git </w:t>
+      </w:r>
+      <w:proofErr w:type="gramStart"/>
+      <w:r>
+        <w:rPr>
+          <w:b/>
+          <w:bCs/>
+          <w:color w:val="FFFFFF"/>
+          <w:lang w:val="pl-PL"/>
+        </w:rPr>
+        <w:t xml:space="preserve">URL:  </w:t>
       </w:r>
       <w:r>
         <w:rPr>
@@ -749,6 +805,7 @@
         </w:rPr>
         <w:t>https://github.com/team-byte-size/team-page/blob/main/docs/design-validation.md</w:t>
       </w:r>
+      <w:proofErr w:type="gramEnd"/>
     </w:p>
     <w:p>
       <w:pPr>
@@ -906,7 +963,15 @@
         <w:t xml:space="preserve">Done: </w:t>
       </w:r>
       <w:r>
-        <w:t>Applied the approved login styling (colors, layout, branding). Confirmed auth logic, validation, and session handling are all untouched.</w:t>
+        <w:t>Applied the approved login styling (</w:t>
+      </w:r>
+      <w:proofErr w:type="spellStart"/>
+      <w:r>
+        <w:t>colors</w:t>
+      </w:r>
+      <w:proofErr w:type="spellEnd"/>
+      <w:r>
+        <w:t>, layout, branding). Confirmed auth logic, validation, and session handling are all untouched.</w:t>
       </w:r>
     </w:p>
     <w:p>
@@ -955,6 +1020,7 @@
           <w:bCs/>
           <w:color w:val="FFFFFF"/>
         </w:rPr>
+        <w:lastRenderedPageBreak/>
         <w:t xml:space="preserve">Git URL (commit):  </w:t>
       </w:r>
       <w:hyperlink r:id="rId11" w:history="1">
@@ -1279,6 +1345,7 @@
         <w:rPr>
           <w:noProof/>
         </w:rPr>
+        <w:lastRenderedPageBreak/>
         <w:drawing>
           <wp:inline distT="0" distB="0" distL="0" distR="0" wp14:anchorId="1D426C83" wp14:editId="65256AE1">
             <wp:extent cx="3503930" cy="2589530"/>
@@ -1408,7 +1475,19 @@
               <w:rPr>
                 <w:color w:val="1E2761"/>
               </w:rPr>
-              <w:t>Dev 2 — Morgan Tran</w:t>
+              <w:t xml:space="preserve">Dev 2 </w:t>
+            </w:r>
+            <w:r>
+              <w:rPr>
+                <w:color w:val="1E2761"/>
+              </w:rPr>
+              <w:t xml:space="preserve">- </w:t>
+            </w:r>
+            <w:r>
+              <w:rPr>
+                <w:color w:val="1E2761"/>
+              </w:rPr>
+              <w:t>Saneli Thathsari Ratnayake</w:t>
             </w:r>
           </w:p>
         </w:tc>
@@ -1452,7 +1531,19 @@
               <w:rPr>
                 <w:color w:val="1E2761"/>
               </w:rPr>
-              <w:t>Thursday, 6 August 2026</w:t>
+              <w:t xml:space="preserve">Thursday, </w:t>
+            </w:r>
+            <w:r>
+              <w:rPr>
+                <w:color w:val="1E2761"/>
+              </w:rPr>
+              <w:t>13</w:t>
+            </w:r>
+            <w:r>
+              <w:rPr>
+                <w:color w:val="1E2761"/>
+              </w:rPr>
+              <w:t xml:space="preserve"> August 2026</w:t>
             </w:r>
           </w:p>
         </w:tc>
@@ -1474,16 +1565,34 @@
     <w:p>
       <w:pPr>
         <w:spacing w:after="60"/>
-      </w:pPr>
-      <w:r>
-        <w:rPr>
-          <w:b/>
-          <w:bCs/>
-        </w:rPr>
-        <w:t xml:space="preserve">Done: </w:t>
-      </w:r>
-      <w:r>
-        <w:t>Tested the full happy path on the deployed URL — valid login, redirect fires, all member cards render correctly with photo/role/blurb, expand-on-long-text works.</w:t>
+        <w:rPr>
+          <w:color w:val="000000" w:themeColor="text1"/>
+        </w:rPr>
+      </w:pPr>
+      <w:r>
+        <w:rPr>
+          <w:b/>
+          <w:bCs/>
+        </w:rPr>
+        <w:t>Done:</w:t>
+      </w:r>
+      <w:r>
+        <w:rPr>
+          <w:color w:val="000000"/>
+        </w:rPr>
+        <w:t xml:space="preserve"> </w:t>
+      </w:r>
+      <w:r>
+        <w:rPr>
+          <w:color w:val="000000" w:themeColor="text1"/>
+        </w:rPr>
+        <w:t>Tested the full happy path flow, valid login, redirected to team page and all the required content verified against Jason’s feature/team page branch, retested after a redirect</w:t>
+      </w:r>
+      <w:r>
+        <w:rPr>
+          <w:color w:val="000000" w:themeColor="text1"/>
+        </w:rPr>
+        <w:t xml:space="preserve"> bug was fixed</w:t>
       </w:r>
     </w:p>
     <w:p>
@@ -1495,10 +1604,16 @@
           <w:b/>
           <w:bCs/>
         </w:rPr>
-        <w:t xml:space="preserve">Deliverable: </w:t>
-      </w:r>
-      <w:r>
-        <w:t>Test script and test report.</w:t>
+        <w:t>Deliverable:</w:t>
+      </w:r>
+      <w:r>
+        <w:t xml:space="preserve"> Test report </w:t>
+      </w:r>
+      <w:r>
+        <w:t xml:space="preserve">- </w:t>
+      </w:r>
+      <w:r>
+        <w:t>docs/TEST-REPORT.md</w:t>
       </w:r>
     </w:p>
     <w:p>
@@ -1510,10 +1625,26 @@
           <w:b/>
           <w:bCs/>
         </w:rPr>
-        <w:t xml:space="preserve">Note for next role: </w:t>
-      </w:r>
-      <w:r>
-        <w:t>No issues found on the happy path. Moving on to edge cases next.</w:t>
+        <w:t>Note for next role</w:t>
+      </w:r>
+      <w:r>
+        <w:rPr>
+          <w:b/>
+          <w:bCs/>
+        </w:rPr>
+        <w:t xml:space="preserve">: </w:t>
+      </w:r>
+      <w:r>
+        <w:t xml:space="preserve">During testing, one bug was found, causing users to </w:t>
+      </w:r>
+      <w:r>
+        <w:t>redirect</w:t>
+      </w:r>
+      <w:r>
+        <w:t xml:space="preserve"> to the Dashboard instead of team page. It was reported to Dev 1 and resolved and retested</w:t>
+      </w:r>
+      <w:r>
+        <w:t xml:space="preserve"> again on the deployed URL after redeployed</w:t>
       </w:r>
     </w:p>
     <w:p>
@@ -1521,6 +1652,11 @@
         <w:shd w:val="clear" w:color="auto" w:fill="16204F"/>
         <w:spacing w:after="120"/>
         <w:ind w:left="100" w:right="100"/>
+        <w:rPr>
+          <w:rFonts w:ascii="Consolas" w:hAnsi="Consolas" w:cs="Consolas"/>
+          <w:sz w:val="20"/>
+          <w:szCs w:val="20"/>
+        </w:rPr>
       </w:pPr>
       <w:r>
         <w:rPr>
@@ -1528,42 +1664,20 @@
           <w:bCs/>
           <w:color w:val="FFFFFF"/>
         </w:rPr>
-        <w:t xml:space="preserve">Git URL (test script):  </w:t>
-      </w:r>
-      <w:r>
-        <w:rPr>
-          <w:rFonts w:ascii="Consolas" w:eastAsia="Consolas" w:hAnsi="Consolas" w:cs="Consolas"/>
-          <w:color w:val="8FD3D6"/>
-        </w:rPr>
-        <w:t>https://github.com/team-byte-size/team-page/blob/main/tests/flow.spec.js</w:t>
-      </w:r>
-    </w:p>
-    <w:p>
-      <w:pPr>
-        <w:shd w:val="clear" w:color="auto" w:fill="16204F"/>
-        <w:spacing w:after="120"/>
-        <w:ind w:left="100" w:right="100"/>
-      </w:pPr>
-      <w:r>
-        <w:rPr>
-          <w:b/>
-          <w:bCs/>
-          <w:color w:val="FFFFFF"/>
-        </w:rPr>
         <w:t xml:space="preserve">Git URL (test report):  </w:t>
       </w:r>
-      <w:r>
-        <w:rPr>
-          <w:rFonts w:ascii="Consolas" w:eastAsia="Consolas" w:hAnsi="Consolas" w:cs="Consolas"/>
-          <w:color w:val="8FD3D6"/>
-        </w:rPr>
-        <w:t>https://github.com/team-byte-size/team-page/blob/main/docs/test-report-flow.md</w:t>
-      </w:r>
-    </w:p>
-    <w:p>
-      <w:pPr>
-        <w:spacing w:after="260"/>
-      </w:pPr>
+      <w:hyperlink r:id="rId14" w:history="1">
+        <w:r>
+          <w:rPr>
+            <w:rStyle w:val="Hyperlink"/>
+            <w:rFonts w:ascii="Consolas" w:hAnsi="Consolas" w:cs="Consolas"/>
+            <w:color w:val="A5C9EB" w:themeColor="text2" w:themeTint="40"/>
+            <w:sz w:val="20"/>
+            <w:szCs w:val="20"/>
+          </w:rPr>
+          <w:t>https://github.com/Jason6322/garage-boilerplate-basic/blob/main/docs/TEST-REPORT.md</w:t>
+        </w:r>
+      </w:hyperlink>
     </w:p>
     <w:p>
       <w:pPr>
@@ -1638,7 +1752,25 @@
               <w:rPr>
                 <w:color w:val="1E2761"/>
               </w:rPr>
-              <w:t>Dev 2 — Morgan Tran</w:t>
+              <w:t xml:space="preserve">Dev 2 </w:t>
+            </w:r>
+            <w:r>
+              <w:rPr>
+                <w:color w:val="1E2761"/>
+              </w:rPr>
+              <w:t>-</w:t>
+            </w:r>
+            <w:r>
+              <w:rPr>
+                <w:color w:val="1E2761"/>
+              </w:rPr>
+              <w:t xml:space="preserve"> </w:t>
+            </w:r>
+            <w:r>
+              <w:rPr>
+                <w:color w:val="1E2761"/>
+              </w:rPr>
+              <w:t>Saneli Thathsari Ratnayake</w:t>
             </w:r>
           </w:p>
         </w:tc>
@@ -1682,7 +1814,19 @@
               <w:rPr>
                 <w:color w:val="1E2761"/>
               </w:rPr>
-              <w:t>Thursday, 6 August 2026</w:t>
+              <w:t xml:space="preserve">Thursday, </w:t>
+            </w:r>
+            <w:r>
+              <w:rPr>
+                <w:color w:val="1E2761"/>
+              </w:rPr>
+              <w:t>13</w:t>
+            </w:r>
+            <w:r>
+              <w:rPr>
+                <w:color w:val="1E2761"/>
+              </w:rPr>
+              <w:t xml:space="preserve"> August 2026</w:t>
             </w:r>
           </w:p>
         </w:tc>
@@ -1704,6 +1848,9 @@
     <w:p>
       <w:pPr>
         <w:spacing w:after="60"/>
+        <w:rPr>
+          <w:color w:val="EE0000"/>
+        </w:rPr>
       </w:pPr>
       <w:r>
         <w:rPr>
@@ -1713,12 +1860,22 @@
         <w:t xml:space="preserve">Done: </w:t>
       </w:r>
       <w:r>
-        <w:t>Tested invalid login, direct team-page URL access without login, missing-photo member, and an unusually long blurb. No bugs found.</w:t>
+        <w:t>T</w:t>
+      </w:r>
+      <w:r>
+        <w:t xml:space="preserve">ested invalid login scenarios, </w:t>
+      </w:r>
+      <w:r>
+        <w:t>access to the team page without logging in, member cards without photos and excessively long blurbs. All tests were passed. A directed bug was discovered, logged with repro instructions, fixed and verified through retesting</w:t>
       </w:r>
     </w:p>
     <w:p>
       <w:pPr>
         <w:spacing w:after="60"/>
+        <w:rPr>
+          <w:b/>
+          <w:bCs/>
+        </w:rPr>
       </w:pPr>
       <w:r>
         <w:rPr>
@@ -1728,23 +1885,63 @@
         <w:t xml:space="preserve">Deliverable: </w:t>
       </w:r>
       <w:r>
-        <w:t>Edge case test report.</w:t>
+        <w:rPr>
+          <w:color w:val="000000" w:themeColor="text1"/>
+        </w:rPr>
+        <w:t xml:space="preserve">Documented </w:t>
+      </w:r>
+      <w:r>
+        <w:rPr>
+          <w:color w:val="000000" w:themeColor="text1"/>
+        </w:rPr>
+        <w:t>the completed edge case results in docs/TES</w:t>
+      </w:r>
+      <w:r>
+        <w:rPr>
+          <w:color w:val="000000" w:themeColor="text1"/>
+        </w:rPr>
+        <w:t>T</w:t>
+      </w:r>
+      <w:r>
+        <w:rPr>
+          <w:color w:val="000000" w:themeColor="text1"/>
+        </w:rPr>
+        <w:t>-REPORT.md under the Bug log section as BUG-01</w:t>
       </w:r>
     </w:p>
     <w:p>
       <w:pPr>
         <w:spacing w:after="140"/>
-      </w:pPr>
-      <w:r>
-        <w:rPr>
-          <w:b/>
-          <w:bCs/>
-        </w:rPr>
-        <w:t xml:space="preserve">Note for next role: </w:t>
-      </w:r>
-      <w:r>
-        <w:t>PM — everything passed, nothing outstanding for Dev 1 to fix before your review.</w:t>
-      </w:r>
+        <w:rPr>
+          <w:color w:val="EE0000"/>
+        </w:rPr>
+      </w:pPr>
+      <w:r>
+        <w:rPr>
+          <w:b/>
+          <w:bCs/>
+        </w:rPr>
+        <w:t>Note for next role</w:t>
+      </w:r>
+      <w:r>
+        <w:rPr>
+          <w:b/>
+          <w:bCs/>
+          <w:color w:val="000000" w:themeColor="text1"/>
+        </w:rPr>
+        <w:t xml:space="preserve">: </w:t>
+      </w:r>
+      <w:r>
+        <w:rPr>
+          <w:color w:val="000000" w:themeColor="text1"/>
+        </w:rPr>
+        <w:t>All edge cases have been passed successfully. The only one bug has been resolved and retested, so Dev 1 has no further tasks</w:t>
+      </w:r>
+    </w:p>
+    <w:p>
+      <w:pPr>
+        <w:spacing w:after="140"/>
+      </w:pPr>
     </w:p>
     <w:p>
       <w:pPr>
@@ -1761,67 +1958,80 @@
         <w:t xml:space="preserve">Git URL (test script):  </w:t>
       </w:r>
       <w:r>
-        <w:rPr>
-          <w:rFonts w:ascii="Consolas" w:eastAsia="Consolas" w:hAnsi="Consolas" w:cs="Consolas"/>
-          <w:color w:val="8FD3D6"/>
-        </w:rPr>
-        <w:t>https://github.com/team-byte-size/team-page/blob/main/tests/edge.spec.js</w:t>
-      </w:r>
-    </w:p>
-    <w:tbl>
-      <w:tblPr>
-        <w:tblW w:w="9000" w:type="dxa"/>
-        <w:tblBorders>
-          <w:top w:val="single" w:sz="4" w:space="0" w:color="auto"/>
-          <w:left w:val="single" w:sz="4" w:space="0" w:color="auto"/>
-          <w:bottom w:val="single" w:sz="4" w:space="0" w:color="auto"/>
-          <w:right w:val="single" w:sz="4" w:space="0" w:color="auto"/>
-          <w:insideH w:val="single" w:sz="4" w:space="0" w:color="auto"/>
-          <w:insideV w:val="single" w:sz="4" w:space="0" w:color="auto"/>
-        </w:tblBorders>
-        <w:tblCellMar>
-          <w:left w:w="10" w:type="dxa"/>
-          <w:right w:w="10" w:type="dxa"/>
-        </w:tblCellMar>
-        <w:tblLook w:val="0000" w:firstRow="0" w:lastRow="0" w:firstColumn="0" w:lastColumn="0" w:noHBand="0" w:noVBand="0"/>
-      </w:tblPr>
-      <w:tblGrid>
-        <w:gridCol w:w="9000"/>
-      </w:tblGrid>
-      <w:tr>
-        <w:tc>
-          <w:tcPr>
-            <w:tcW w:w="9000" w:type="dxa"/>
-            <w:tcBorders>
-              <w:top w:val="dashed" w:sz="4" w:space="0" w:color="AAAAAA"/>
-              <w:left w:val="dashed" w:sz="4" w:space="0" w:color="AAAAAA"/>
-              <w:bottom w:val="dashed" w:sz="4" w:space="0" w:color="AAAAAA"/>
-              <w:right w:val="dashed" w:sz="4" w:space="0" w:color="AAAAAA"/>
-            </w:tcBorders>
-            <w:shd w:val="clear" w:color="auto" w:fill="F0F0F0"/>
-            <w:tcMar>
-              <w:top w:w="300" w:type="dxa"/>
-              <w:left w:w="200" w:type="dxa"/>
-              <w:bottom w:w="300" w:type="dxa"/>
-              <w:right w:w="200" w:type="dxa"/>
-            </w:tcMar>
-          </w:tcPr>
-          <w:p>
-            <w:pPr>
-              <w:jc w:val="center"/>
-            </w:pPr>
-            <w:r>
-              <w:rPr>
-                <w:i/>
-                <w:iCs/>
-                <w:color w:val="888888"/>
-              </w:rPr>
-              <w:t>[ IMAGE PLACEHOLDER — Invalid login error state screenshot — replace with actual screenshot ]</w:t>
-            </w:r>
-          </w:p>
-        </w:tc>
-      </w:tr>
-    </w:tbl>
+        <w:t xml:space="preserve">N/A </w:t>
+      </w:r>
+      <w:r>
+        <w:t>-</w:t>
+      </w:r>
+      <w:r>
+        <w:t xml:space="preserve"> manual testing, documented in test report above</w:t>
+      </w:r>
+    </w:p>
+    <w:p>
+      <w:pPr>
+        <w:spacing w:after="260"/>
+      </w:pPr>
+      <w:r>
+        <w:drawing>
+          <wp:inline distT="0" distB="0" distL="0" distR="0" wp14:anchorId="59518636" wp14:editId="417115EA">
+            <wp:extent cx="5943600" cy="3865245"/>
+            <wp:effectExtent l="12700" t="12700" r="12700" b="8255"/>
+            <wp:docPr id="1571083252" name="Picture 1"/>
+            <wp:cNvGraphicFramePr>
+              <a:graphicFrameLocks xmlns:a="http://schemas.openxmlformats.org/drawingml/2006/main" noChangeAspect="1"/>
+            </wp:cNvGraphicFramePr>
+            <a:graphic xmlns:a="http://schemas.openxmlformats.org/drawingml/2006/main">
+              <a:graphicData uri="http://schemas.openxmlformats.org/drawingml/2006/picture">
+                <pic:pic xmlns:pic="http://schemas.openxmlformats.org/drawingml/2006/picture">
+                  <pic:nvPicPr>
+                    <pic:cNvPr id="1571083252" name=""/>
+                    <pic:cNvPicPr/>
+                  </pic:nvPicPr>
+                  <pic:blipFill>
+                    <a:blip r:embed="rId15"/>
+                    <a:stretch>
+                      <a:fillRect/>
+                    </a:stretch>
+                  </pic:blipFill>
+                  <pic:spPr>
+                    <a:xfrm>
+                      <a:off x="0" y="0"/>
+                      <a:ext cx="5943600" cy="3865245"/>
+                    </a:xfrm>
+                    <a:prstGeom prst="rect">
+                      <a:avLst/>
+                    </a:prstGeom>
+                    <a:ln>
+                      <a:solidFill>
+                        <a:schemeClr val="tx1"/>
+                      </a:solidFill>
+                    </a:ln>
+                  </pic:spPr>
+                </pic:pic>
+              </a:graphicData>
+            </a:graphic>
+          </wp:inline>
+        </w:drawing>
+      </w:r>
+    </w:p>
+    <w:p>
+      <w:pPr>
+        <w:spacing w:after="260"/>
+        <w:rPr>
+          <w:i/>
+          <w:iCs/>
+          <w:color w:val="888888"/>
+        </w:rPr>
+      </w:pPr>
+      <w:r>
+        <w:rPr>
+          <w:i/>
+          <w:iCs/>
+          <w:color w:val="888888"/>
+        </w:rPr>
+        <w:t>Invalid login error state screenshot</w:t>
+      </w:r>
+    </w:p>
     <w:p>
       <w:pPr>
         <w:spacing w:after="260"/>
@@ -2024,7 +2234,17 @@
           <w:color w:val="FFFFFF"/>
           <w:lang w:val="pl-PL"/>
         </w:rPr>
-        <w:t xml:space="preserve">Git URL:  </w:t>
+        <w:t xml:space="preserve">Git </w:t>
+      </w:r>
+      <w:proofErr w:type="gramStart"/>
+      <w:r>
+        <w:rPr>
+          <w:b/>
+          <w:bCs/>
+          <w:color w:val="FFFFFF"/>
+          <w:lang w:val="pl-PL"/>
+        </w:rPr>
+        <w:t xml:space="preserve">URL:  </w:t>
       </w:r>
       <w:r>
         <w:rPr>
@@ -2034,6 +2254,7 @@
         </w:rPr>
         <w:t>https://github.com/team-byte-size/team-page/blob/main/docs/signoff.md</w:t>
       </w:r>
+      <w:proofErr w:type="gramEnd"/>
     </w:p>
     <w:p>
       <w:pPr>
@@ -2043,9 +2264,109 @@
         </w:rPr>
       </w:pPr>
     </w:p>
+    <w:p>
+      <w:pPr>
+        <w:spacing w:after="260"/>
+        <w:rPr>
+          <w:lang w:val="pl-PL"/>
+        </w:rPr>
+      </w:pPr>
+    </w:p>
+    <w:p>
+      <w:pPr>
+        <w:spacing w:after="260"/>
+        <w:rPr>
+          <w:lang w:val="pl-PL"/>
+        </w:rPr>
+      </w:pPr>
+    </w:p>
+    <w:p>
+      <w:pPr>
+        <w:spacing w:after="260"/>
+      </w:pPr>
+      <w:r>
+        <w:t>[BOOTSTRAP RESTYLING] Test Login → Redirect → Team Page Flow</w:t>
+      </w:r>
+      <w:r>
+        <w:br/>
+        <w:t>Role: Dev 2 — Saneli Thathsari Ratnayake | Date: Thursday, 14 August 2026</w:t>
+      </w:r>
+      <w:r>
+        <w:br/>
+        <w:t>Completion comment</w:t>
+      </w:r>
+    </w:p>
+    <w:p>
+      <w:pPr>
+        <w:spacing w:after="260"/>
+      </w:pPr>
+      <w:r>
+        <w:t>Done: Tested the full happy path — valid login, redirect to team page, and all team page content (team name, member cards, roles, blurbs) verified against Jason's feature/team-page branch, retested after a redirect bug was fixed.</w:t>
+      </w:r>
+      <w:r>
+        <w:br/>
+        <w:t>Deliverable: Test report — docs/TEST-REPORT.md</w:t>
+      </w:r>
+      <w:r>
+        <w:br/>
+        <w:t>Note for next role: Found one bug during testing (login redirected to Dashboard instead of Team page) — reported to Dev 1, fixed, and retested as passing. Pending one final retest on the deployed URL once it's redeployed live.</w:t>
+      </w:r>
+      <w:r>
+        <w:br/>
+        <w:t xml:space="preserve">Git URL (test report): </w:t>
+      </w:r>
+      <w:hyperlink r:id="rId16" w:history="1">
+        <w:r>
+          <w:rPr>
+            <w:color w:val="0000FF"/>
+            <w:u w:val="single"/>
+          </w:rPr>
+          <w:t>https://github.com/Jason6322/garage-boilerplate-basic/blob/docs/dev2-testing-update/docs/TEST-REPORT.md</w:t>
+        </w:r>
+      </w:hyperlink>
+    </w:p>
+    <w:p>
+      <w:pPr>
+        <w:spacing w:after="260"/>
+      </w:pPr>
+    </w:p>
+    <w:p>
+      <w:pPr>
+        <w:spacing w:after="260"/>
+      </w:pPr>
+    </w:p>
+    <w:p>
+      <w:pPr>
+        <w:spacing w:after="260"/>
+      </w:pPr>
+    </w:p>
+    <w:p>
+      <w:pPr>
+        <w:spacing w:after="260"/>
+      </w:pPr>
+      <w:r>
+        <w:t xml:space="preserve">[BOOTSTRAP RESTYLING] Test Login → Redirect → Team Page Flow </w:t>
+      </w:r>
+    </w:p>
+    <w:p>
+      <w:pPr>
+        <w:spacing w:after="260"/>
+      </w:pPr>
+      <w:r>
+        <w:t>Role: DEV 2 – Saneli Thathsari Ratnayake | Date: Thursday, 14 August 2026</w:t>
+      </w:r>
+    </w:p>
+    <w:p>
+      <w:pPr>
+        <w:spacing w:after="260"/>
+      </w:pPr>
+      <w:r>
+        <w:t>Completion comment</w:t>
+      </w:r>
+    </w:p>
     <w:sectPr>
-      <w:headerReference w:type="default" r:id="rId14"/>
-      <w:footerReference w:type="default" r:id="rId15"/>
+      <w:headerReference w:type="default" r:id="rId17"/>
+      <w:footerReference w:type="default" r:id="rId18"/>
       <w:pgSz w:w="12240" w:h="15840"/>
       <w:pgMar w:top="1440" w:right="1440" w:bottom="1440" w:left="1440" w:header="708" w:footer="708" w:gutter="0"/>
       <w:cols w:space="720"/>
@@ -2056,7 +2377,7 @@
 </file>
 
 <file path=word/endnotes.xml><?xml version="1.0" encoding="utf-8"?>
-<w:endnotes xmlns:wpc="http://schemas.microsoft.com/office/word/2010/wordprocessingCanvas" xmlns:cx="http://schemas.microsoft.com/office/drawing/2014/chartex" xmlns:cx1="http://schemas.microsoft.com/office/drawing/2015/9/8/chartex" xmlns:cx2="http://schemas.microsoft.com/office/drawing/2015/10/21/chartex" xmlns:cx3="http://schemas.microsoft.com/office/drawing/2016/5/9/chartex" xmlns:cx4="http://schemas.microsoft.com/office/drawing/2016/5/10/chartex" xmlns:cx5="http://schemas.microsoft.com/office/drawing/2016/5/11/chartex" xmlns:cx6="http://schemas.microsoft.com/office/drawing/2016/5/12/chartex" xmlns:cx7="http://schemas.microsoft.com/office/drawing/2016/5/13/chartex" xmlns:cx8="http://schemas.microsoft.com/office/drawing/2016/5/14/chartex" xmlns:mc="http://schemas.openxmlformats.org/markup-compatibility/2006" xmlns:aink="http://schemas.microsoft.com/office/drawing/2016/ink" xmlns:am3d="http://schemas.microsoft.com/office/drawing/2017/model3d" xmlns:o="urn:schemas-microsoft-com:office:office" xmlns:oel="http://schemas.microsoft.com/office/2019/extlst" xmlns:r="http://schemas.openxmlformats.org/officeDocument/2006/relationships" xmlns:m="http://schemas.openxmlformats.org/officeDocument/2006/math" xmlns:v="urn:schemas-microsoft-com:vml" xmlns:wp14="http://schemas.microsoft.com/office/word/2010/wordprocessingDrawing" xmlns:wp="http://schemas.openxmlformats.org/drawingml/2006/wordprocessingDrawing" xmlns:w10="urn:schemas-microsoft-com:office:word" xmlns:w="http://schemas.openxmlformats.org/wordprocessingml/2006/main" xmlns:w14="http://schemas.microsoft.com/office/word/2010/wordml" xmlns:w15="http://schemas.microsoft.com/office/word/2012/wordml" xmlns:w16cex="http://schemas.microsoft.com/office/word/2018/wordml/cex" xmlns:w16cid="http://schemas.microsoft.com/office/word/2016/wordml/cid" xmlns:w16="http://schemas.microsoft.com/office/word/2018/wordml" xmlns:w16du="http://schemas.microsoft.com/office/word/2023/wordml/word16du" xmlns:w16sdtdh="http://schemas.microsoft.com/office/word/2020/wordml/sdtdatahash" xmlns:w16sdtfl="http://schemas.microsoft.com/office/word/2024/wordml/sdtformatlock" xmlns:w16se="http://schemas.microsoft.com/office/word/2015/wordml/symex" xmlns:wpg="http://schemas.microsoft.com/office/word/2010/wordprocessingGroup" xmlns:wpi="http://schemas.microsoft.com/office/word/2010/wordprocessingInk" xmlns:wne="http://schemas.microsoft.com/office/word/2006/wordml" xmlns:wps="http://schemas.microsoft.com/office/word/2010/wordprocessingShape" mc:Ignorable="w14 w15 w16se w16cid w16 w16cex w16sdtdh w16sdtfl w16du wp14">
+<w:endnotes xmlns:wpc="http://schemas.microsoft.com/office/word/2010/wordprocessingCanvas" xmlns:cx="http://schemas.microsoft.com/office/drawing/2014/chartex" xmlns:cx1="http://schemas.microsoft.com/office/drawing/2015/9/8/chartex" xmlns:cx2="http://schemas.microsoft.com/office/drawing/2015/10/21/chartex" xmlns:cx3="http://schemas.microsoft.com/office/drawing/2016/5/9/chartex" xmlns:cx4="http://schemas.microsoft.com/office/drawing/2016/5/10/chartex" xmlns:cx5="http://schemas.microsoft.com/office/drawing/2016/5/11/chartex" xmlns:cx6="http://schemas.microsoft.com/office/drawing/2016/5/12/chartex" xmlns:cx7="http://schemas.microsoft.com/office/drawing/2016/5/13/chartex" xmlns:cx8="http://schemas.microsoft.com/office/drawing/2016/5/14/chartex" xmlns:mc="http://schemas.openxmlformats.org/markup-compatibility/2006" xmlns:m="http://schemas.openxmlformats.org/officeDocument/2006/math" xmlns:aink="http://schemas.microsoft.com/office/drawing/2016/ink" xmlns:am3d="http://schemas.microsoft.com/office/drawing/2017/model3d" xmlns:oel="http://schemas.microsoft.com/office/2019/extlst" xmlns:r="http://schemas.openxmlformats.org/officeDocument/2006/relationships" xmlns:wp14="http://schemas.microsoft.com/office/word/2010/wordprocessingDrawing" xmlns:wp="http://schemas.openxmlformats.org/drawingml/2006/wordprocessingDrawing" xmlns:wpg="http://schemas.microsoft.com/office/word/2010/wordprocessingGroup" xmlns:wpi="http://schemas.microsoft.com/office/word/2010/wordprocessingInk" xmlns:wps="http://schemas.microsoft.com/office/word/2010/wordprocessingShape" xmlns:o="urn:schemas-microsoft-com:office:office" xmlns:v="urn:schemas-microsoft-com:vml" xmlns:w10="urn:schemas-microsoft-com:office:word" xmlns:w="http://schemas.openxmlformats.org/wordprocessingml/2006/main" xmlns:w14="http://schemas.microsoft.com/office/word/2010/wordml" xmlns:w15="http://schemas.microsoft.com/office/word/2012/wordml" xmlns:w16cex="http://schemas.microsoft.com/office/word/2018/wordml/cex" xmlns:w16cid="http://schemas.microsoft.com/office/word/2016/wordml/cid" xmlns:w16="http://schemas.microsoft.com/office/word/2018/wordml" xmlns:w16sdtdh="http://schemas.microsoft.com/office/word/2020/wordml/sdtdatahash" xmlns:w16sdtfl="http://schemas.microsoft.com/office/word/2024/wordml/sdtformatlock" xmlns:w16se="http://schemas.microsoft.com/office/word/2015/wordml/symex" xmlns:w16du="http://schemas.microsoft.com/office/word/2023/wordml/word16du" xmlns:wne="http://schemas.microsoft.com/office/word/2006/wordml" mc:Ignorable="w14 w15 w16se w16cid w16 w16cex w16sdtdh w16sdtfl w16du wp14">
   <w:endnote w:type="separator" w:id="-1">
     <w:p>
       <w:r>
@@ -2075,7 +2396,7 @@
 </file>
 
 <file path=word/footer1.xml><?xml version="1.0" encoding="utf-8"?>
-<w:ftr xmlns:wpc="http://schemas.microsoft.com/office/word/2010/wordprocessingCanvas" xmlns:cx="http://schemas.microsoft.com/office/drawing/2014/chartex" xmlns:cx1="http://schemas.microsoft.com/office/drawing/2015/9/8/chartex" xmlns:cx2="http://schemas.microsoft.com/office/drawing/2015/10/21/chartex" xmlns:cx3="http://schemas.microsoft.com/office/drawing/2016/5/9/chartex" xmlns:cx4="http://schemas.microsoft.com/office/drawing/2016/5/10/chartex" xmlns:cx5="http://schemas.microsoft.com/office/drawing/2016/5/11/chartex" xmlns:cx6="http://schemas.microsoft.com/office/drawing/2016/5/12/chartex" xmlns:cx7="http://schemas.microsoft.com/office/drawing/2016/5/13/chartex" xmlns:cx8="http://schemas.microsoft.com/office/drawing/2016/5/14/chartex" xmlns:mc="http://schemas.openxmlformats.org/markup-compatibility/2006" xmlns:aink="http://schemas.microsoft.com/office/drawing/2016/ink" xmlns:am3d="http://schemas.microsoft.com/office/drawing/2017/model3d" xmlns:o="urn:schemas-microsoft-com:office:office" xmlns:oel="http://schemas.microsoft.com/office/2019/extlst" xmlns:r="http://schemas.openxmlformats.org/officeDocument/2006/relationships" xmlns:m="http://schemas.openxmlformats.org/officeDocument/2006/math" xmlns:v="urn:schemas-microsoft-com:vml" xmlns:wp14="http://schemas.microsoft.com/office/word/2010/wordprocessingDrawing" xmlns:wp="http://schemas.openxmlformats.org/drawingml/2006/wordprocessingDrawing" xmlns:w10="urn:schemas-microsoft-com:office:word" xmlns:w="http://schemas.openxmlformats.org/wordprocessingml/2006/main" xmlns:w14="http://schemas.microsoft.com/office/word/2010/wordml" xmlns:w15="http://schemas.microsoft.com/office/word/2012/wordml" xmlns:w16cex="http://schemas.microsoft.com/office/word/2018/wordml/cex" xmlns:w16cid="http://schemas.microsoft.com/office/word/2016/wordml/cid" xmlns:w16="http://schemas.microsoft.com/office/word/2018/wordml" xmlns:w16du="http://schemas.microsoft.com/office/word/2023/wordml/word16du" xmlns:w16sdtdh="http://schemas.microsoft.com/office/word/2020/wordml/sdtdatahash" xmlns:w16sdtfl="http://schemas.microsoft.com/office/word/2024/wordml/sdtformatlock" xmlns:w16se="http://schemas.microsoft.com/office/word/2015/wordml/symex" xmlns:wpg="http://schemas.microsoft.com/office/word/2010/wordprocessingGroup" xmlns:wpi="http://schemas.microsoft.com/office/word/2010/wordprocessingInk" xmlns:wne="http://schemas.microsoft.com/office/word/2006/wordml" xmlns:wps="http://schemas.microsoft.com/office/word/2010/wordprocessingShape" mc:Ignorable="w14 w15 w16se w16cid w16 w16cex w16sdtdh w16sdtfl w16du wp14">
+<w:ftr xmlns:wpc="http://schemas.microsoft.com/office/word/2010/wordprocessingCanvas" xmlns:cx="http://schemas.microsoft.com/office/drawing/2014/chartex" xmlns:cx1="http://schemas.microsoft.com/office/drawing/2015/9/8/chartex" xmlns:cx2="http://schemas.microsoft.com/office/drawing/2015/10/21/chartex" xmlns:cx3="http://schemas.microsoft.com/office/drawing/2016/5/9/chartex" xmlns:cx4="http://schemas.microsoft.com/office/drawing/2016/5/10/chartex" xmlns:cx5="http://schemas.microsoft.com/office/drawing/2016/5/11/chartex" xmlns:cx6="http://schemas.microsoft.com/office/drawing/2016/5/12/chartex" xmlns:cx7="http://schemas.microsoft.com/office/drawing/2016/5/13/chartex" xmlns:cx8="http://schemas.microsoft.com/office/drawing/2016/5/14/chartex" xmlns:mc="http://schemas.openxmlformats.org/markup-compatibility/2006" xmlns:m="http://schemas.openxmlformats.org/officeDocument/2006/math" xmlns:aink="http://schemas.microsoft.com/office/drawing/2016/ink" xmlns:am3d="http://schemas.microsoft.com/office/drawing/2017/model3d" xmlns:oel="http://schemas.microsoft.com/office/2019/extlst" xmlns:r="http://schemas.openxmlformats.org/officeDocument/2006/relationships" xmlns:wp14="http://schemas.microsoft.com/office/word/2010/wordprocessingDrawing" xmlns:wp="http://schemas.openxmlformats.org/drawingml/2006/wordprocessingDrawing" xmlns:wpg="http://schemas.microsoft.com/office/word/2010/wordprocessingGroup" xmlns:wpi="http://schemas.microsoft.com/office/word/2010/wordprocessingInk" xmlns:wps="http://schemas.microsoft.com/office/word/2010/wordprocessingShape" xmlns:o="urn:schemas-microsoft-com:office:office" xmlns:v="urn:schemas-microsoft-com:vml" xmlns:w10="urn:schemas-microsoft-com:office:word" xmlns:w="http://schemas.openxmlformats.org/wordprocessingml/2006/main" xmlns:w14="http://schemas.microsoft.com/office/word/2010/wordml" xmlns:w15="http://schemas.microsoft.com/office/word/2012/wordml" xmlns:w16cex="http://schemas.microsoft.com/office/word/2018/wordml/cex" xmlns:w16cid="http://schemas.microsoft.com/office/word/2016/wordml/cid" xmlns:w16="http://schemas.microsoft.com/office/word/2018/wordml" xmlns:w16sdtdh="http://schemas.microsoft.com/office/word/2020/wordml/sdtdatahash" xmlns:w16sdtfl="http://schemas.microsoft.com/office/word/2024/wordml/sdtformatlock" xmlns:w16se="http://schemas.microsoft.com/office/word/2015/wordml/symex" xmlns:w16du="http://schemas.microsoft.com/office/word/2023/wordml/word16du" xmlns:wne="http://schemas.microsoft.com/office/word/2006/wordml" mc:Ignorable="w14 w15 w16se w16cid w16 w16cex w16sdtdh w16sdtfl w16du wp14">
   <w:tbl>
     <w:tblPr>
       <w:tblW w:w="0" w:type="auto"/>
@@ -2135,7 +2456,7 @@
 </file>
 
 <file path=word/footnotes.xml><?xml version="1.0" encoding="utf-8"?>
-<w:footnotes xmlns:wpc="http://schemas.microsoft.com/office/word/2010/wordprocessingCanvas" xmlns:cx="http://schemas.microsoft.com/office/drawing/2014/chartex" xmlns:cx1="http://schemas.microsoft.com/office/drawing/2015/9/8/chartex" xmlns:cx2="http://schemas.microsoft.com/office/drawing/2015/10/21/chartex" xmlns:cx3="http://schemas.microsoft.com/office/drawing/2016/5/9/chartex" xmlns:cx4="http://schemas.microsoft.com/office/drawing/2016/5/10/chartex" xmlns:cx5="http://schemas.microsoft.com/office/drawing/2016/5/11/chartex" xmlns:cx6="http://schemas.microsoft.com/office/drawing/2016/5/12/chartex" xmlns:cx7="http://schemas.microsoft.com/office/drawing/2016/5/13/chartex" xmlns:cx8="http://schemas.microsoft.com/office/drawing/2016/5/14/chartex" xmlns:mc="http://schemas.openxmlformats.org/markup-compatibility/2006" xmlns:aink="http://schemas.microsoft.com/office/drawing/2016/ink" xmlns:am3d="http://schemas.microsoft.com/office/drawing/2017/model3d" xmlns:o="urn:schemas-microsoft-com:office:office" xmlns:oel="http://schemas.microsoft.com/office/2019/extlst" xmlns:r="http://schemas.openxmlformats.org/officeDocument/2006/relationships" xmlns:m="http://schemas.openxmlformats.org/officeDocument/2006/math" xmlns:v="urn:schemas-microsoft-com:vml" xmlns:wp14="http://schemas.microsoft.com/office/word/2010/wordprocessingDrawing" xmlns:wp="http://schemas.openxmlformats.org/drawingml/2006/wordprocessingDrawing" xmlns:w10="urn:schemas-microsoft-com:office:word" xmlns:w="http://schemas.openxmlformats.org/wordprocessingml/2006/main" xmlns:w14="http://schemas.microsoft.com/office/word/2010/wordml" xmlns:w15="http://schemas.microsoft.com/office/word/2012/wordml" xmlns:w16cex="http://schemas.microsoft.com/office/word/2018/wordml/cex" xmlns:w16cid="http://schemas.microsoft.com/office/word/2016/wordml/cid" xmlns:w16="http://schemas.microsoft.com/office/word/2018/wordml" xmlns:w16du="http://schemas.microsoft.com/office/word/2023/wordml/word16du" xmlns:w16sdtdh="http://schemas.microsoft.com/office/word/2020/wordml/sdtdatahash" xmlns:w16sdtfl="http://schemas.microsoft.com/office/word/2024/wordml/sdtformatlock" xmlns:w16se="http://schemas.microsoft.com/office/word/2015/wordml/symex" xmlns:wpg="http://schemas.microsoft.com/office/word/2010/wordprocessingGroup" xmlns:wpi="http://schemas.microsoft.com/office/word/2010/wordprocessingInk" xmlns:wne="http://schemas.microsoft.com/office/word/2006/wordml" xmlns:wps="http://schemas.microsoft.com/office/word/2010/wordprocessingShape" mc:Ignorable="w14 w15 w16se w16cid w16 w16cex w16sdtdh w16sdtfl w16du wp14">
+<w:footnotes xmlns:wpc="http://schemas.microsoft.com/office/word/2010/wordprocessingCanvas" xmlns:cx="http://schemas.microsoft.com/office/drawing/2014/chartex" xmlns:cx1="http://schemas.microsoft.com/office/drawing/2015/9/8/chartex" xmlns:cx2="http://schemas.microsoft.com/office/drawing/2015/10/21/chartex" xmlns:cx3="http://schemas.microsoft.com/office/drawing/2016/5/9/chartex" xmlns:cx4="http://schemas.microsoft.com/office/drawing/2016/5/10/chartex" xmlns:cx5="http://schemas.microsoft.com/office/drawing/2016/5/11/chartex" xmlns:cx6="http://schemas.microsoft.com/office/drawing/2016/5/12/chartex" xmlns:cx7="http://schemas.microsoft.com/office/drawing/2016/5/13/chartex" xmlns:cx8="http://schemas.microsoft.com/office/drawing/2016/5/14/chartex" xmlns:mc="http://schemas.openxmlformats.org/markup-compatibility/2006" xmlns:m="http://schemas.openxmlformats.org/officeDocument/2006/math" xmlns:aink="http://schemas.microsoft.com/office/drawing/2016/ink" xmlns:am3d="http://schemas.microsoft.com/office/drawing/2017/model3d" xmlns:oel="http://schemas.microsoft.com/office/2019/extlst" xmlns:r="http://schemas.openxmlformats.org/officeDocument/2006/relationships" xmlns:wp14="http://schemas.microsoft.com/office/word/2010/wordprocessingDrawing" xmlns:wp="http://schemas.openxmlformats.org/drawingml/2006/wordprocessingDrawing" xmlns:wpg="http://schemas.microsoft.com/office/word/2010/wordprocessingGroup" xmlns:wpi="http://schemas.microsoft.com/office/word/2010/wordprocessingInk" xmlns:wps="http://schemas.microsoft.com/office/word/2010/wordprocessingShape" xmlns:o="urn:schemas-microsoft-com:office:office" xmlns:v="urn:schemas-microsoft-com:vml" xmlns:w10="urn:schemas-microsoft-com:office:word" xmlns:w="http://schemas.openxmlformats.org/wordprocessingml/2006/main" xmlns:w14="http://schemas.microsoft.com/office/word/2010/wordml" xmlns:w15="http://schemas.microsoft.com/office/word/2012/wordml" xmlns:w16cex="http://schemas.microsoft.com/office/word/2018/wordml/cex" xmlns:w16cid="http://schemas.microsoft.com/office/word/2016/wordml/cid" xmlns:w16="http://schemas.microsoft.com/office/word/2018/wordml" xmlns:w16sdtdh="http://schemas.microsoft.com/office/word/2020/wordml/sdtdatahash" xmlns:w16sdtfl="http://schemas.microsoft.com/office/word/2024/wordml/sdtformatlock" xmlns:w16se="http://schemas.microsoft.com/office/word/2015/wordml/symex" xmlns:w16du="http://schemas.microsoft.com/office/word/2023/wordml/word16du" xmlns:wne="http://schemas.microsoft.com/office/word/2006/wordml" mc:Ignorable="w14 w15 w16se w16cid w16 w16cex w16sdtdh w16sdtfl w16du wp14">
   <w:footnote w:type="separator" w:id="-1">
     <w:p>
       <w:r>
@@ -2154,7 +2475,7 @@
 </file>
 
 <file path=word/header1.xml><?xml version="1.0" encoding="utf-8"?>
-<w:hdr xmlns:wpc="http://schemas.microsoft.com/office/word/2010/wordprocessingCanvas" xmlns:cx="http://schemas.microsoft.com/office/drawing/2014/chartex" xmlns:cx1="http://schemas.microsoft.com/office/drawing/2015/9/8/chartex" xmlns:cx2="http://schemas.microsoft.com/office/drawing/2015/10/21/chartex" xmlns:cx3="http://schemas.microsoft.com/office/drawing/2016/5/9/chartex" xmlns:cx4="http://schemas.microsoft.com/office/drawing/2016/5/10/chartex" xmlns:cx5="http://schemas.microsoft.com/office/drawing/2016/5/11/chartex" xmlns:cx6="http://schemas.microsoft.com/office/drawing/2016/5/12/chartex" xmlns:cx7="http://schemas.microsoft.com/office/drawing/2016/5/13/chartex" xmlns:cx8="http://schemas.microsoft.com/office/drawing/2016/5/14/chartex" xmlns:mc="http://schemas.openxmlformats.org/markup-compatibility/2006" xmlns:aink="http://schemas.microsoft.com/office/drawing/2016/ink" xmlns:am3d="http://schemas.microsoft.com/office/drawing/2017/model3d" xmlns:o="urn:schemas-microsoft-com:office:office" xmlns:oel="http://schemas.microsoft.com/office/2019/extlst" xmlns:r="http://schemas.openxmlformats.org/officeDocument/2006/relationships" xmlns:m="http://schemas.openxmlformats.org/officeDocument/2006/math" xmlns:v="urn:schemas-microsoft-com:vml" xmlns:wp14="http://schemas.microsoft.com/office/word/2010/wordprocessingDrawing" xmlns:wp="http://schemas.openxmlformats.org/drawingml/2006/wordprocessingDrawing" xmlns:w10="urn:schemas-microsoft-com:office:word" xmlns:w="http://schemas.openxmlformats.org/wordprocessingml/2006/main" xmlns:w14="http://schemas.microsoft.com/office/word/2010/wordml" xmlns:w15="http://schemas.microsoft.com/office/word/2012/wordml" xmlns:w16cex="http://schemas.microsoft.com/office/word/2018/wordml/cex" xmlns:w16cid="http://schemas.microsoft.com/office/word/2016/wordml/cid" xmlns:w16="http://schemas.microsoft.com/office/word/2018/wordml" xmlns:w16du="http://schemas.microsoft.com/office/word/2023/wordml/word16du" xmlns:w16sdtdh="http://schemas.microsoft.com/office/word/2020/wordml/sdtdatahash" xmlns:w16sdtfl="http://schemas.microsoft.com/office/word/2024/wordml/sdtformatlock" xmlns:w16se="http://schemas.microsoft.com/office/word/2015/wordml/symex" xmlns:wpg="http://schemas.microsoft.com/office/word/2010/wordprocessingGroup" xmlns:wpi="http://schemas.microsoft.com/office/word/2010/wordprocessingInk" xmlns:wne="http://schemas.microsoft.com/office/word/2006/wordml" xmlns:wps="http://schemas.microsoft.com/office/word/2010/wordprocessingShape" mc:Ignorable="w14 w15 w16se w16cid w16 w16cex w16sdtdh w16sdtfl w16du wp14">
+<w:hdr xmlns:wpc="http://schemas.microsoft.com/office/word/2010/wordprocessingCanvas" xmlns:cx="http://schemas.microsoft.com/office/drawing/2014/chartex" xmlns:cx1="http://schemas.microsoft.com/office/drawing/2015/9/8/chartex" xmlns:cx2="http://schemas.microsoft.com/office/drawing/2015/10/21/chartex" xmlns:cx3="http://schemas.microsoft.com/office/drawing/2016/5/9/chartex" xmlns:cx4="http://schemas.microsoft.com/office/drawing/2016/5/10/chartex" xmlns:cx5="http://schemas.microsoft.com/office/drawing/2016/5/11/chartex" xmlns:cx6="http://schemas.microsoft.com/office/drawing/2016/5/12/chartex" xmlns:cx7="http://schemas.microsoft.com/office/drawing/2016/5/13/chartex" xmlns:cx8="http://schemas.microsoft.com/office/drawing/2016/5/14/chartex" xmlns:mc="http://schemas.openxmlformats.org/markup-compatibility/2006" xmlns:m="http://schemas.openxmlformats.org/officeDocument/2006/math" xmlns:aink="http://schemas.microsoft.com/office/drawing/2016/ink" xmlns:am3d="http://schemas.microsoft.com/office/drawing/2017/model3d" xmlns:oel="http://schemas.microsoft.com/office/2019/extlst" xmlns:r="http://schemas.openxmlformats.org/officeDocument/2006/relationships" xmlns:wp14="http://schemas.microsoft.com/office/word/2010/wordprocessingDrawing" xmlns:wp="http://schemas.openxmlformats.org/drawingml/2006/wordprocessingDrawing" xmlns:wpg="http://schemas.microsoft.com/office/word/2010/wordprocessingGroup" xmlns:wpi="http://schemas.microsoft.com/office/word/2010/wordprocessingInk" xmlns:wps="http://schemas.microsoft.com/office/word/2010/wordprocessingShape" xmlns:o="urn:schemas-microsoft-com:office:office" xmlns:v="urn:schemas-microsoft-com:vml" xmlns:w10="urn:schemas-microsoft-com:office:word" xmlns:w="http://schemas.openxmlformats.org/wordprocessingml/2006/main" xmlns:w14="http://schemas.microsoft.com/office/word/2010/wordml" xmlns:w15="http://schemas.microsoft.com/office/word/2012/wordml" xmlns:w16cex="http://schemas.microsoft.com/office/word/2018/wordml/cex" xmlns:w16cid="http://schemas.microsoft.com/office/word/2016/wordml/cid" xmlns:w16="http://schemas.microsoft.com/office/word/2018/wordml" xmlns:w16sdtdh="http://schemas.microsoft.com/office/word/2020/wordml/sdtdatahash" xmlns:w16sdtfl="http://schemas.microsoft.com/office/word/2024/wordml/sdtformatlock" xmlns:w16se="http://schemas.microsoft.com/office/word/2015/wordml/symex" xmlns:w16du="http://schemas.microsoft.com/office/word/2023/wordml/word16du" xmlns:wne="http://schemas.microsoft.com/office/word/2006/wordml" mc:Ignorable="w14 w15 w16se w16cid w16 w16cex w16sdtdh w16sdtfl w16du wp14">
   <w:p>
     <w:pPr>
       <w:pStyle w:val="Header"/>
@@ -2224,7 +2545,7 @@
 </file>
 
 <file path=word/numbering.xml><?xml version="1.0" encoding="utf-8"?>
-<w:numbering xmlns:wpc="http://schemas.microsoft.com/office/word/2010/wordprocessingCanvas" xmlns:cx="http://schemas.microsoft.com/office/drawing/2014/chartex" xmlns:cx1="http://schemas.microsoft.com/office/drawing/2015/9/8/chartex" xmlns:cx2="http://schemas.microsoft.com/office/drawing/2015/10/21/chartex" xmlns:cx3="http://schemas.microsoft.com/office/drawing/2016/5/9/chartex" xmlns:cx4="http://schemas.microsoft.com/office/drawing/2016/5/10/chartex" xmlns:cx5="http://schemas.microsoft.com/office/drawing/2016/5/11/chartex" xmlns:cx6="http://schemas.microsoft.com/office/drawing/2016/5/12/chartex" xmlns:cx7="http://schemas.microsoft.com/office/drawing/2016/5/13/chartex" xmlns:cx8="http://schemas.microsoft.com/office/drawing/2016/5/14/chartex" xmlns:mc="http://schemas.openxmlformats.org/markup-compatibility/2006" xmlns:aink="http://schemas.microsoft.com/office/drawing/2016/ink" xmlns:am3d="http://schemas.microsoft.com/office/drawing/2017/model3d" xmlns:o="urn:schemas-microsoft-com:office:office" xmlns:oel="http://schemas.microsoft.com/office/2019/extlst" xmlns:r="http://schemas.openxmlformats.org/officeDocument/2006/relationships" xmlns:m="http://schemas.openxmlformats.org/officeDocument/2006/math" xmlns:v="urn:schemas-microsoft-com:vml" xmlns:wp14="http://schemas.microsoft.com/office/word/2010/wordprocessingDrawing" xmlns:wp="http://schemas.openxmlformats.org/drawingml/2006/wordprocessingDrawing" xmlns:w10="urn:schemas-microsoft-com:office:word" xmlns:w="http://schemas.openxmlformats.org/wordprocessingml/2006/main" xmlns:w14="http://schemas.microsoft.com/office/word/2010/wordml" xmlns:w15="http://schemas.microsoft.com/office/word/2012/wordml" xmlns:w16cex="http://schemas.microsoft.com/office/word/2018/wordml/cex" xmlns:w16cid="http://schemas.microsoft.com/office/word/2016/wordml/cid" xmlns:w16="http://schemas.microsoft.com/office/word/2018/wordml" xmlns:w16du="http://schemas.microsoft.com/office/word/2023/wordml/word16du" xmlns:w16sdtdh="http://schemas.microsoft.com/office/word/2020/wordml/sdtdatahash" xmlns:w16sdtfl="http://schemas.microsoft.com/office/word/2024/wordml/sdtformatlock" xmlns:w16se="http://schemas.microsoft.com/office/word/2015/wordml/symex" xmlns:wpg="http://schemas.microsoft.com/office/word/2010/wordprocessingGroup" xmlns:wpi="http://schemas.microsoft.com/office/word/2010/wordprocessingInk" xmlns:wne="http://schemas.microsoft.com/office/word/2006/wordml" xmlns:wps="http://schemas.microsoft.com/office/word/2010/wordprocessingShape" mc:Ignorable="w14 w15 w16se w16cid w16 w16cex w16sdtdh w16sdtfl w16du wp14">
+<w:numbering xmlns:wpc="http://schemas.microsoft.com/office/word/2010/wordprocessingCanvas" xmlns:cx="http://schemas.microsoft.com/office/drawing/2014/chartex" xmlns:cx1="http://schemas.microsoft.com/office/drawing/2015/9/8/chartex" xmlns:cx2="http://schemas.microsoft.com/office/drawing/2015/10/21/chartex" xmlns:cx3="http://schemas.microsoft.com/office/drawing/2016/5/9/chartex" xmlns:cx4="http://schemas.microsoft.com/office/drawing/2016/5/10/chartex" xmlns:cx5="http://schemas.microsoft.com/office/drawing/2016/5/11/chartex" xmlns:cx6="http://schemas.microsoft.com/office/drawing/2016/5/12/chartex" xmlns:cx7="http://schemas.microsoft.com/office/drawing/2016/5/13/chartex" xmlns:cx8="http://schemas.microsoft.com/office/drawing/2016/5/14/chartex" xmlns:mc="http://schemas.openxmlformats.org/markup-compatibility/2006" xmlns:m="http://schemas.openxmlformats.org/officeDocument/2006/math" xmlns:aink="http://schemas.microsoft.com/office/drawing/2016/ink" xmlns:am3d="http://schemas.microsoft.com/office/drawing/2017/model3d" xmlns:oel="http://schemas.microsoft.com/office/2019/extlst" xmlns:r="http://schemas.openxmlformats.org/officeDocument/2006/relationships" xmlns:wp14="http://schemas.microsoft.com/office/word/2010/wordprocessingDrawing" xmlns:wp="http://schemas.openxmlformats.org/drawingml/2006/wordprocessingDrawing" xmlns:wpg="http://schemas.microsoft.com/office/word/2010/wordprocessingGroup" xmlns:wpi="http://schemas.microsoft.com/office/word/2010/wordprocessingInk" xmlns:wps="http://schemas.microsoft.com/office/word/2010/wordprocessingShape" xmlns:o="urn:schemas-microsoft-com:office:office" xmlns:v="urn:schemas-microsoft-com:vml" xmlns:w10="urn:schemas-microsoft-com:office:word" xmlns:w="http://schemas.openxmlformats.org/wordprocessingml/2006/main" xmlns:w14="http://schemas.microsoft.com/office/word/2010/wordml" xmlns:w15="http://schemas.microsoft.com/office/word/2012/wordml" xmlns:w16cex="http://schemas.microsoft.com/office/word/2018/wordml/cex" xmlns:w16cid="http://schemas.microsoft.com/office/word/2016/wordml/cid" xmlns:w16="http://schemas.microsoft.com/office/word/2018/wordml" xmlns:w16sdtdh="http://schemas.microsoft.com/office/word/2020/wordml/sdtdatahash" xmlns:w16sdtfl="http://schemas.microsoft.com/office/word/2024/wordml/sdtformatlock" xmlns:w16se="http://schemas.microsoft.com/office/word/2015/wordml/symex" xmlns:w16du="http://schemas.microsoft.com/office/word/2023/wordml/word16du" xmlns:wne="http://schemas.microsoft.com/office/word/2006/wordml" mc:Ignorable="w14 w15 w16se w16cid w16 w16cex w16sdtdh w16sdtfl w16du wp14">
   <w:abstractNum w:abstractNumId="0" w15:restartNumberingAfterBreak="0">
     <w:nsid w:val="050B24B6"/>
     <w:multiLevelType w:val="hybridMultilevel"/>
@@ -2321,7 +2642,7 @@
 </file>
 
 <file path=word/styles.xml><?xml version="1.0" encoding="utf-8"?>
-<w:styles xmlns:mc="http://schemas.openxmlformats.org/markup-compatibility/2006" xmlns:r="http://schemas.openxmlformats.org/officeDocument/2006/relationships" xmlns:w="http://schemas.openxmlformats.org/wordprocessingml/2006/main" xmlns:w14="http://schemas.microsoft.com/office/word/2010/wordml" xmlns:w15="http://schemas.microsoft.com/office/word/2012/wordml" xmlns:w16cex="http://schemas.microsoft.com/office/word/2018/wordml/cex" xmlns:w16cid="http://schemas.microsoft.com/office/word/2016/wordml/cid" xmlns:w16="http://schemas.microsoft.com/office/word/2018/wordml" xmlns:w16du="http://schemas.microsoft.com/office/word/2023/wordml/word16du" xmlns:w16sdtdh="http://schemas.microsoft.com/office/word/2020/wordml/sdtdatahash" xmlns:w16sdtfl="http://schemas.microsoft.com/office/word/2024/wordml/sdtformatlock" xmlns:w16se="http://schemas.microsoft.com/office/word/2015/wordml/symex" mc:Ignorable="w14 w15 w16se w16cid w16 w16cex w16sdtdh w16sdtfl w16du">
+<w:styles xmlns:mc="http://schemas.openxmlformats.org/markup-compatibility/2006" xmlns:r="http://schemas.openxmlformats.org/officeDocument/2006/relationships" xmlns:w="http://schemas.openxmlformats.org/wordprocessingml/2006/main" xmlns:w14="http://schemas.microsoft.com/office/word/2010/wordml" xmlns:w15="http://schemas.microsoft.com/office/word/2012/wordml" xmlns:w16cex="http://schemas.microsoft.com/office/word/2018/wordml/cex" xmlns:w16cid="http://schemas.microsoft.com/office/word/2016/wordml/cid" xmlns:w16="http://schemas.microsoft.com/office/word/2018/wordml" xmlns:w16sdtdh="http://schemas.microsoft.com/office/word/2020/wordml/sdtdatahash" xmlns:w16sdtfl="http://schemas.microsoft.com/office/word/2024/wordml/sdtformatlock" xmlns:w16se="http://schemas.microsoft.com/office/word/2015/wordml/symex" xmlns:w16du="http://schemas.microsoft.com/office/word/2023/wordml/word16du" mc:Ignorable="w14 w15 w16se w16cid w16 w16cex w16sdtdh w16sdtfl w16du">
   <w:docDefaults>
     <w:rPrDefault>
       <w:rPr>
@@ -3011,6 +3332,31 @@
       </w:tblBorders>
     </w:tblPr>
   </w:style>
+  <w:style w:type="character" w:styleId="FollowedHyperlink">
+    <w:name w:val="FollowedHyperlink"/>
+    <w:basedOn w:val="DefaultParagraphFont"/>
+    <w:uiPriority w:val="99"/>
+    <w:semiHidden/>
+    <w:unhideWhenUsed/>
+    <w:rsid w:val="00923296"/>
+    <w:rPr>
+      <w:color w:val="96607D" w:themeColor="followedHyperlink"/>
+      <w:u w:val="single"/>
+    </w:rPr>
+  </w:style>
+  <w:style w:type="character" w:styleId="HTMLCode">
+    <w:name w:val="HTML Code"/>
+    <w:basedOn w:val="DefaultParagraphFont"/>
+    <w:uiPriority w:val="99"/>
+    <w:semiHidden/>
+    <w:unhideWhenUsed/>
+    <w:rsid w:val="000336E5"/>
+    <w:rPr>
+      <w:rFonts w:ascii="Courier New" w:eastAsia="Times New Roman" w:hAnsi="Courier New" w:cs="Courier New"/>
+      <w:sz w:val="20"/>
+      <w:szCs w:val="20"/>
+    </w:rPr>
+  </w:style>
 </w:styles>
 </file>
 
@@ -3330,12 +3676,13 @@
 </file>
 
 <file path=customXml/item1.xml><?xml version="1.0" encoding="utf-8"?>
-<?mso-contentType ?>
-<FormTemplates xmlns="http://schemas.microsoft.com/sharepoint/v3/contenttype/forms">
-  <Display>DocumentLibraryForm</Display>
-  <Edit>DocumentLibraryForm</Edit>
-  <New>DocumentLibraryForm</New>
-</FormTemplates>
+<p:properties xmlns:p="http://schemas.microsoft.com/office/2006/metadata/properties" xmlns:xsi="http://www.w3.org/2001/XMLSchema-instance" xmlns:pc="http://schemas.microsoft.com/office/infopath/2007/PartnerControls">
+  <documentManagement>
+    <lcf76f155ced4ddcb4097134ff3c332f xmlns="26c2b24a-a057-4aca-9b64-9bcaa58ad00d">
+      <Terms xmlns="http://schemas.microsoft.com/office/infopath/2007/PartnerControls"/>
+    </lcf76f155ced4ddcb4097134ff3c332f>
+  </documentManagement>
+</p:properties>
 </file>
 
 <file path=customXml/item2.xml><?xml version="1.0" encoding="utf-8"?>
@@ -3517,19 +3864,20 @@
 </file>
 
 <file path=customXml/item3.xml><?xml version="1.0" encoding="utf-8"?>
-<p:properties xmlns:p="http://schemas.microsoft.com/office/2006/metadata/properties" xmlns:xsi="http://www.w3.org/2001/XMLSchema-instance" xmlns:pc="http://schemas.microsoft.com/office/infopath/2007/PartnerControls">
-  <documentManagement>
-    <lcf76f155ced4ddcb4097134ff3c332f xmlns="26c2b24a-a057-4aca-9b64-9bcaa58ad00d">
-      <Terms xmlns="http://schemas.microsoft.com/office/infopath/2007/PartnerControls"/>
-    </lcf76f155ced4ddcb4097134ff3c332f>
-  </documentManagement>
-</p:properties>
+<?mso-contentType ?>
+<FormTemplates xmlns="http://schemas.microsoft.com/sharepoint/v3/contenttype/forms">
+  <Display>DocumentLibraryForm</Display>
+  <Edit>DocumentLibraryForm</Edit>
+  <New>DocumentLibraryForm</New>
+</FormTemplates>
 </file>
 
 <file path=customXml/itemProps1.xml><?xml version="1.0" encoding="utf-8"?>
-<ds:datastoreItem xmlns:ds="http://schemas.openxmlformats.org/officeDocument/2006/customXml" ds:itemID="{F1CC0820-7030-4A87-BCBE-6174B93C7B40}">
+<ds:datastoreItem xmlns:ds="http://schemas.openxmlformats.org/officeDocument/2006/customXml" ds:itemID="{9D7F2ABC-FBDF-4EC4-A8F5-138427A7805D}">
   <ds:schemaRefs>
-    <ds:schemaRef ds:uri="http://schemas.microsoft.com/sharepoint/v3/contenttype/forms"/>
+    <ds:schemaRef ds:uri="http://schemas.microsoft.com/office/2006/metadata/properties"/>
+    <ds:schemaRef ds:uri="http://schemas.microsoft.com/office/infopath/2007/PartnerControls"/>
+    <ds:schemaRef ds:uri="26c2b24a-a057-4aca-9b64-9bcaa58ad00d"/>
   </ds:schemaRefs>
 </ds:datastoreItem>
 </file>
@@ -3553,11 +3901,9 @@
 </file>
 
 <file path=customXml/itemProps3.xml><?xml version="1.0" encoding="utf-8"?>
-<ds:datastoreItem xmlns:ds="http://schemas.openxmlformats.org/officeDocument/2006/customXml" ds:itemID="{9D7F2ABC-FBDF-4EC4-A8F5-138427A7805D}">
+<ds:datastoreItem xmlns:ds="http://schemas.openxmlformats.org/officeDocument/2006/customXml" ds:itemID="{F1CC0820-7030-4A87-BCBE-6174B93C7B40}">
   <ds:schemaRefs>
-    <ds:schemaRef ds:uri="http://schemas.microsoft.com/office/2006/metadata/properties"/>
-    <ds:schemaRef ds:uri="http://schemas.microsoft.com/office/infopath/2007/PartnerControls"/>
-    <ds:schemaRef ds:uri="26c2b24a-a057-4aca-9b64-9bcaa58ad00d"/>
+    <ds:schemaRef ds:uri="http://schemas.microsoft.com/sharepoint/v3/contenttype/forms"/>
   </ds:schemaRefs>
 </ds:datastoreItem>
 </file>

</xml_diff>